<commit_message>
Gestão de Perfil de Usuário
Funcionalidade:  Gestão de Perfil de Usuário
</commit_message>
<xml_diff>
--- a/Docs/Funcionalidade.docx
+++ b/Docs/Funcionalidade.docx
@@ -4,242 +4,261 @@
   <w:body>
     <w:p>
       <w:r>
-        <w:rPr>
-          <w:b/>
-          <w:bCs/>
-        </w:rPr>
-        <w:t>Funcionalidade:</w:t>
-      </w:r>
-      <w:r>
         <w:t> </w:t>
       </w:r>
-      <w:r>
-        <w:rPr>
-          <w:b/>
-          <w:bCs/>
-        </w:rPr>
-        <w:t xml:space="preserve"> Gestão de Perfil de Usuário </w:t>
-      </w:r>
-      <w:r>
-        <w:t> </w:t>
-      </w:r>
-    </w:p>
-    <w:p>
-      <w:r>
-        <w:t>  </w:t>
-      </w:r>
-    </w:p>
-    <w:p>
-      <w:r>
-        <w:rPr>
-          <w:b/>
-          <w:bCs/>
-        </w:rPr>
-        <w:t>1. Visualizar e atualizar dados cadastrais próprios</w:t>
-      </w:r>
-      <w:r>
-        <w:t> </w:t>
-      </w:r>
-    </w:p>
-    <w:p>
-      <w:r>
-        <w:rPr>
-          <w:b/>
-          <w:bCs/>
-        </w:rPr>
-        <w:t xml:space="preserve">Dado: </w:t>
-      </w:r>
-      <w:r>
-        <w:t>Que um usuário acessa a tela de perfil. </w:t>
-      </w:r>
-    </w:p>
-    <w:p>
-      <w:r>
-        <w:rPr>
-          <w:b/>
-          <w:bCs/>
-        </w:rPr>
-        <w:t xml:space="preserve">Quando: </w:t>
-      </w:r>
-      <w:r>
-        <w:t>O usuário clica no botão de perfil. </w:t>
-      </w:r>
-    </w:p>
-    <w:p>
-      <w:r>
-        <w:rPr>
-          <w:b/>
-          <w:bCs/>
-        </w:rPr>
-        <w:t xml:space="preserve">Então: </w:t>
-      </w:r>
-      <w:r>
-        <w:t>O sistema deve permitir a visualização e atualização dos dados cadastrais do próprio usuário, incluindo alteração de senha, foto, e-mail e dados pessoais, mantendo o histórico de alterações. </w:t>
-      </w:r>
-    </w:p>
-    <w:p>
-      <w:r>
-        <w:t> </w:t>
-      </w:r>
-    </w:p>
-    <w:p>
-      <w:r>
-        <w:rPr>
-          <w:b/>
-          <w:bCs/>
-        </w:rPr>
-        <w:t>2. Exibir opções de edição</w:t>
-      </w:r>
-      <w:r>
-        <w:t> </w:t>
-      </w:r>
-    </w:p>
-    <w:p>
-      <w:r>
-        <w:rPr>
-          <w:b/>
-          <w:bCs/>
-        </w:rPr>
-        <w:t xml:space="preserve">Dado: </w:t>
-      </w:r>
-      <w:r>
-        <w:t>Que um usuário acessa a página de edição de perfil. </w:t>
-      </w:r>
-    </w:p>
-    <w:p>
-      <w:r>
-        <w:rPr>
-          <w:b/>
-          <w:bCs/>
-        </w:rPr>
-        <w:t xml:space="preserve">Quando: </w:t>
-      </w:r>
-      <w:r>
-        <w:t>O usuário clica no botão "Editar". </w:t>
-      </w:r>
-    </w:p>
-    <w:p>
-      <w:r>
-        <w:rPr>
-          <w:b/>
-          <w:bCs/>
-        </w:rPr>
-        <w:t xml:space="preserve">Então: </w:t>
-      </w:r>
-      <w:r>
-        <w:t>O sistema deve exibir as opções disponíveis para modificação dos dados do perfil. </w:t>
-      </w:r>
-    </w:p>
-    <w:p>
-      <w:r>
-        <w:t> </w:t>
-      </w:r>
-    </w:p>
-    <w:p>
-      <w:r>
-        <w:rPr>
-          <w:b/>
-          <w:bCs/>
-        </w:rPr>
-        <w:t>3. Validação de senha repetida ou inválida</w:t>
-      </w:r>
-      <w:r>
-        <w:t> </w:t>
-      </w:r>
-    </w:p>
-    <w:p>
-      <w:r>
-        <w:rPr>
-          <w:b/>
-          <w:bCs/>
-        </w:rPr>
-        <w:t xml:space="preserve">Dado: </w:t>
-      </w:r>
-      <w:r>
-        <w:t>Que um usuário insere uma senha igual à anterior ou uma senha inválida durante a alteração de senha. </w:t>
-      </w:r>
-    </w:p>
-    <w:p>
-      <w:r>
-        <w:rPr>
-          <w:b/>
-          <w:bCs/>
-        </w:rPr>
-        <w:t xml:space="preserve">Quando: </w:t>
-      </w:r>
-      <w:r>
-        <w:t>O usuário confirma a alteração. </w:t>
-      </w:r>
-    </w:p>
-    <w:p>
-      <w:r>
-        <w:rPr>
-          <w:b/>
-          <w:bCs/>
-        </w:rPr>
-        <w:t xml:space="preserve">Então: </w:t>
-      </w:r>
-      <w:r>
-        <w:t>O sistema deve exibir uma mensagem informando que a senha não pode ser igual à anterior ou que a senha é inválida. </w:t>
-      </w:r>
-    </w:p>
-    <w:p>
-      <w:r>
-        <w:t> </w:t>
-      </w:r>
-    </w:p>
-    <w:p>
-      <w:r>
-        <w:rPr>
-          <w:b/>
-          <w:bCs/>
-        </w:rPr>
-        <w:t>4. Confirmação de alteração bem-sucedida</w:t>
-      </w:r>
-      <w:r>
-        <w:t> </w:t>
-      </w:r>
-    </w:p>
-    <w:p>
-      <w:r>
-        <w:rPr>
-          <w:b/>
-          <w:bCs/>
-        </w:rPr>
-        <w:t xml:space="preserve">Dado: </w:t>
-      </w:r>
-      <w:r>
-        <w:t>Que um usuário realiza alteração no e-mail ou senha e todas as validações são atendidas. </w:t>
-      </w:r>
-    </w:p>
-    <w:p>
-      <w:r>
-        <w:rPr>
-          <w:b/>
-          <w:bCs/>
-        </w:rPr>
-        <w:t xml:space="preserve">Quando: </w:t>
-      </w:r>
-      <w:r>
-        <w:t>O usuário confirma as alterações. </w:t>
-      </w:r>
-    </w:p>
-    <w:p>
-      <w:r>
-        <w:rPr>
-          <w:b/>
-          <w:bCs/>
-        </w:rPr>
-        <w:t xml:space="preserve">Então: </w:t>
-      </w:r>
-      <w:r>
-        <w:t>O sistema deve exibir uma mensagem de sucesso informando que a alteração foi realizada com êxito. </w:t>
-      </w:r>
-    </w:p>
-    <w:p/>
+    </w:p>
+    <w:p>
+      <w:pPr>
+        <w:rPr>
+          <w:b/>
+          <w:bCs/>
+        </w:rPr>
+      </w:pPr>
+      <w:r>
+        <w:rPr>
+          <w:b/>
+          <w:bCs/>
+        </w:rPr>
+        <w:t xml:space="preserve">Funcionalidade:  Gestão de Perfil de Usuário  </w:t>
+      </w:r>
+    </w:p>
+    <w:p>
+      <w:pPr>
+        <w:rPr>
+          <w:b/>
+          <w:bCs/>
+        </w:rPr>
+      </w:pPr>
+      <w:r>
+        <w:rPr>
+          <w:b/>
+          <w:bCs/>
+        </w:rPr>
+        <w:t xml:space="preserve">1. Visualizar e atualizar dados cadastrais próprios </w:t>
+      </w:r>
+    </w:p>
+    <w:p>
+      <w:pPr>
+        <w:rPr>
+          <w:b/>
+          <w:bCs/>
+        </w:rPr>
+      </w:pPr>
+      <w:r>
+        <w:rPr>
+          <w:b/>
+          <w:bCs/>
+        </w:rPr>
+        <w:t xml:space="preserve">Dado: Que um usuário acessa a tela de perfil. </w:t>
+      </w:r>
+    </w:p>
+    <w:p>
+      <w:pPr>
+        <w:rPr>
+          <w:b/>
+          <w:bCs/>
+        </w:rPr>
+      </w:pPr>
+      <w:r>
+        <w:rPr>
+          <w:b/>
+          <w:bCs/>
+        </w:rPr>
+        <w:t xml:space="preserve">Quando: O usuário clica no botão de perfil. </w:t>
+      </w:r>
+    </w:p>
+    <w:p>
+      <w:pPr>
+        <w:rPr>
+          <w:b/>
+          <w:bCs/>
+        </w:rPr>
+      </w:pPr>
+      <w:r>
+        <w:rPr>
+          <w:b/>
+          <w:bCs/>
+        </w:rPr>
+        <w:t xml:space="preserve">Então: O sistema deve permitir a visualização e atualização dos dados cadastrais do próprio usuário, incluindo alteração de senha, foto, e-mail e dados pessoais, mantendo o histórico de alterações. </w:t>
+      </w:r>
+    </w:p>
+    <w:p>
+      <w:pPr>
+        <w:rPr>
+          <w:b/>
+          <w:bCs/>
+        </w:rPr>
+      </w:pPr>
+      <w:r>
+        <w:rPr>
+          <w:b/>
+          <w:bCs/>
+        </w:rPr>
+        <w:t xml:space="preserve">2. Exibir opções de edição </w:t>
+      </w:r>
+    </w:p>
+    <w:p>
+      <w:pPr>
+        <w:rPr>
+          <w:b/>
+          <w:bCs/>
+        </w:rPr>
+      </w:pPr>
+      <w:r>
+        <w:rPr>
+          <w:b/>
+          <w:bCs/>
+        </w:rPr>
+        <w:t xml:space="preserve">Dado: Que um usuário acessa a página de edição de perfil. </w:t>
+      </w:r>
+    </w:p>
+    <w:p>
+      <w:pPr>
+        <w:rPr>
+          <w:b/>
+          <w:bCs/>
+        </w:rPr>
+      </w:pPr>
+      <w:r>
+        <w:rPr>
+          <w:b/>
+          <w:bCs/>
+        </w:rPr>
+        <w:t xml:space="preserve">Quando: O usuário clica no botão "Editar". </w:t>
+      </w:r>
+    </w:p>
+    <w:p>
+      <w:pPr>
+        <w:rPr>
+          <w:b/>
+          <w:bCs/>
+        </w:rPr>
+      </w:pPr>
+      <w:r>
+        <w:rPr>
+          <w:b/>
+          <w:bCs/>
+        </w:rPr>
+        <w:t xml:space="preserve">Então: O sistema deve exibir as opções disponíveis para modificação dos dados do perfil. </w:t>
+      </w:r>
+    </w:p>
+    <w:p>
+      <w:pPr>
+        <w:rPr>
+          <w:b/>
+          <w:bCs/>
+        </w:rPr>
+      </w:pPr>
+      <w:r>
+        <w:rPr>
+          <w:b/>
+          <w:bCs/>
+        </w:rPr>
+        <w:t xml:space="preserve">3. Validação de senha repetida ou inválida </w:t>
+      </w:r>
+    </w:p>
+    <w:p>
+      <w:pPr>
+        <w:rPr>
+          <w:b/>
+          <w:bCs/>
+        </w:rPr>
+      </w:pPr>
+      <w:r>
+        <w:rPr>
+          <w:b/>
+          <w:bCs/>
+        </w:rPr>
+        <w:t xml:space="preserve">Dado: Que um usuário insere uma senha igual à anterior ou uma senha inválida durante a alteração de senha. </w:t>
+      </w:r>
+    </w:p>
+    <w:p>
+      <w:pPr>
+        <w:rPr>
+          <w:b/>
+          <w:bCs/>
+        </w:rPr>
+      </w:pPr>
+      <w:r>
+        <w:rPr>
+          <w:b/>
+          <w:bCs/>
+        </w:rPr>
+        <w:t xml:space="preserve">Quando: O usuário confirma a alteração. </w:t>
+      </w:r>
+    </w:p>
+    <w:p>
+      <w:pPr>
+        <w:rPr>
+          <w:b/>
+          <w:bCs/>
+        </w:rPr>
+      </w:pPr>
+      <w:r>
+        <w:rPr>
+          <w:b/>
+          <w:bCs/>
+        </w:rPr>
+        <w:t xml:space="preserve">Então: O sistema deve exibir uma mensagem informando que a senha não pode ser igual à anterior ou que a senha é inválida. </w:t>
+      </w:r>
+    </w:p>
+    <w:p>
+      <w:pPr>
+        <w:rPr>
+          <w:b/>
+          <w:bCs/>
+        </w:rPr>
+      </w:pPr>
+      <w:r>
+        <w:rPr>
+          <w:b/>
+          <w:bCs/>
+        </w:rPr>
+        <w:t xml:space="preserve">4. Confirmação de alteração bem-sucedida </w:t>
+      </w:r>
+    </w:p>
+    <w:p>
+      <w:pPr>
+        <w:rPr>
+          <w:b/>
+          <w:bCs/>
+        </w:rPr>
+      </w:pPr>
+      <w:r>
+        <w:rPr>
+          <w:b/>
+          <w:bCs/>
+        </w:rPr>
+        <w:t xml:space="preserve">Dado: Que um usuário realiza alteração no e-mail ou senha e todas as validações são atendidas. </w:t>
+      </w:r>
+    </w:p>
+    <w:p>
+      <w:pPr>
+        <w:rPr>
+          <w:b/>
+          <w:bCs/>
+        </w:rPr>
+      </w:pPr>
+      <w:r>
+        <w:rPr>
+          <w:b/>
+          <w:bCs/>
+        </w:rPr>
+        <w:t xml:space="preserve">Quando: O usuário confirma as alterações. </w:t>
+      </w:r>
+    </w:p>
+    <w:p>
+      <w:r>
+        <w:rPr>
+          <w:b/>
+          <w:bCs/>
+        </w:rPr>
+        <w:t>Então: O sistema deve exibir uma mensagem de sucesso informando que a alteração foi realizada com êxito.</w:t>
+      </w:r>
+    </w:p>
     <w:sectPr>
       <w:pgSz w:w="11906" w:h="16838"/>
-      <w:pgMar w:top="1417" w:right="1701" w:bottom="1417" w:left="1701" w:header="708" w:footer="708" w:gutter="0"/>
+      <w:pgMar w:top="720" w:right="720" w:bottom="720" w:left="720" w:header="708" w:footer="708" w:gutter="0"/>
       <w:cols w:space="708"/>
       <w:docGrid w:linePitch="360"/>
     </w:sectPr>
@@ -655,7 +674,7 @@
     <w:link w:val="Ttulo1Char"/>
     <w:uiPriority w:val="9"/>
     <w:qFormat/>
-    <w:rsid w:val="00DE21B1"/>
+    <w:rsid w:val="00E26CF4"/>
     <w:pPr>
       <w:keepNext/>
       <w:keepLines/>
@@ -678,7 +697,7 @@
     <w:semiHidden/>
     <w:unhideWhenUsed/>
     <w:qFormat/>
-    <w:rsid w:val="00DE21B1"/>
+    <w:rsid w:val="00E26CF4"/>
     <w:pPr>
       <w:keepNext/>
       <w:keepLines/>
@@ -701,7 +720,7 @@
     <w:semiHidden/>
     <w:unhideWhenUsed/>
     <w:qFormat/>
-    <w:rsid w:val="00DE21B1"/>
+    <w:rsid w:val="00E26CF4"/>
     <w:pPr>
       <w:keepNext/>
       <w:keepLines/>
@@ -724,7 +743,7 @@
     <w:semiHidden/>
     <w:unhideWhenUsed/>
     <w:qFormat/>
-    <w:rsid w:val="00DE21B1"/>
+    <w:rsid w:val="00E26CF4"/>
     <w:pPr>
       <w:keepNext/>
       <w:keepLines/>
@@ -747,7 +766,7 @@
     <w:semiHidden/>
     <w:unhideWhenUsed/>
     <w:qFormat/>
-    <w:rsid w:val="00DE21B1"/>
+    <w:rsid w:val="00E26CF4"/>
     <w:pPr>
       <w:keepNext/>
       <w:keepLines/>
@@ -768,7 +787,7 @@
     <w:semiHidden/>
     <w:unhideWhenUsed/>
     <w:qFormat/>
-    <w:rsid w:val="00DE21B1"/>
+    <w:rsid w:val="00E26CF4"/>
     <w:pPr>
       <w:keepNext/>
       <w:keepLines/>
@@ -791,7 +810,7 @@
     <w:semiHidden/>
     <w:unhideWhenUsed/>
     <w:qFormat/>
-    <w:rsid w:val="00DE21B1"/>
+    <w:rsid w:val="00E26CF4"/>
     <w:pPr>
       <w:keepNext/>
       <w:keepLines/>
@@ -812,7 +831,7 @@
     <w:semiHidden/>
     <w:unhideWhenUsed/>
     <w:qFormat/>
-    <w:rsid w:val="00DE21B1"/>
+    <w:rsid w:val="00E26CF4"/>
     <w:pPr>
       <w:keepNext/>
       <w:keepLines/>
@@ -835,7 +854,7 @@
     <w:semiHidden/>
     <w:unhideWhenUsed/>
     <w:qFormat/>
-    <w:rsid w:val="00DE21B1"/>
+    <w:rsid w:val="00E26CF4"/>
     <w:pPr>
       <w:keepNext/>
       <w:keepLines/>
@@ -850,6 +869,7 @@
   <w:style w:type="character" w:default="1" w:styleId="Fontepargpadro">
     <w:name w:val="Default Paragraph Font"/>
     <w:uiPriority w:val="1"/>
+    <w:semiHidden/>
     <w:unhideWhenUsed/>
   </w:style>
   <w:style w:type="table" w:default="1" w:styleId="Tabelanormal">
@@ -878,7 +898,7 @@
     <w:basedOn w:val="Fontepargpadro"/>
     <w:link w:val="Ttulo1"/>
     <w:uiPriority w:val="9"/>
-    <w:rsid w:val="00DE21B1"/>
+    <w:rsid w:val="00E26CF4"/>
     <w:rPr>
       <w:rFonts w:asciiTheme="majorHAnsi" w:eastAsiaTheme="majorEastAsia" w:hAnsiTheme="majorHAnsi" w:cstheme="majorBidi"/>
       <w:color w:val="0F4761" w:themeColor="accent1" w:themeShade="BF"/>
@@ -892,7 +912,7 @@
     <w:link w:val="Ttulo2"/>
     <w:uiPriority w:val="9"/>
     <w:semiHidden/>
-    <w:rsid w:val="00DE21B1"/>
+    <w:rsid w:val="00E26CF4"/>
     <w:rPr>
       <w:rFonts w:asciiTheme="majorHAnsi" w:eastAsiaTheme="majorEastAsia" w:hAnsiTheme="majorHAnsi" w:cstheme="majorBidi"/>
       <w:color w:val="0F4761" w:themeColor="accent1" w:themeShade="BF"/>
@@ -906,7 +926,7 @@
     <w:link w:val="Ttulo3"/>
     <w:uiPriority w:val="9"/>
     <w:semiHidden/>
-    <w:rsid w:val="00DE21B1"/>
+    <w:rsid w:val="00E26CF4"/>
     <w:rPr>
       <w:rFonts w:eastAsiaTheme="majorEastAsia" w:cstheme="majorBidi"/>
       <w:color w:val="0F4761" w:themeColor="accent1" w:themeShade="BF"/>
@@ -920,7 +940,7 @@
     <w:link w:val="Ttulo4"/>
     <w:uiPriority w:val="9"/>
     <w:semiHidden/>
-    <w:rsid w:val="00DE21B1"/>
+    <w:rsid w:val="00E26CF4"/>
     <w:rPr>
       <w:rFonts w:eastAsiaTheme="majorEastAsia" w:cstheme="majorBidi"/>
       <w:i/>
@@ -934,7 +954,7 @@
     <w:link w:val="Ttulo5"/>
     <w:uiPriority w:val="9"/>
     <w:semiHidden/>
-    <w:rsid w:val="00DE21B1"/>
+    <w:rsid w:val="00E26CF4"/>
     <w:rPr>
       <w:rFonts w:eastAsiaTheme="majorEastAsia" w:cstheme="majorBidi"/>
       <w:color w:val="0F4761" w:themeColor="accent1" w:themeShade="BF"/>
@@ -946,7 +966,7 @@
     <w:link w:val="Ttulo6"/>
     <w:uiPriority w:val="9"/>
     <w:semiHidden/>
-    <w:rsid w:val="00DE21B1"/>
+    <w:rsid w:val="00E26CF4"/>
     <w:rPr>
       <w:rFonts w:eastAsiaTheme="majorEastAsia" w:cstheme="majorBidi"/>
       <w:i/>
@@ -960,7 +980,7 @@
     <w:link w:val="Ttulo7"/>
     <w:uiPriority w:val="9"/>
     <w:semiHidden/>
-    <w:rsid w:val="00DE21B1"/>
+    <w:rsid w:val="00E26CF4"/>
     <w:rPr>
       <w:rFonts w:eastAsiaTheme="majorEastAsia" w:cstheme="majorBidi"/>
       <w:color w:val="595959" w:themeColor="text1" w:themeTint="A6"/>
@@ -972,7 +992,7 @@
     <w:link w:val="Ttulo8"/>
     <w:uiPriority w:val="9"/>
     <w:semiHidden/>
-    <w:rsid w:val="00DE21B1"/>
+    <w:rsid w:val="00E26CF4"/>
     <w:rPr>
       <w:rFonts w:eastAsiaTheme="majorEastAsia" w:cstheme="majorBidi"/>
       <w:i/>
@@ -986,7 +1006,7 @@
     <w:link w:val="Ttulo9"/>
     <w:uiPriority w:val="9"/>
     <w:semiHidden/>
-    <w:rsid w:val="00DE21B1"/>
+    <w:rsid w:val="00E26CF4"/>
     <w:rPr>
       <w:rFonts w:eastAsiaTheme="majorEastAsia" w:cstheme="majorBidi"/>
       <w:color w:val="272727" w:themeColor="text1" w:themeTint="D8"/>
@@ -999,7 +1019,7 @@
     <w:link w:val="TtuloChar"/>
     <w:uiPriority w:val="10"/>
     <w:qFormat/>
-    <w:rsid w:val="00DE21B1"/>
+    <w:rsid w:val="00E26CF4"/>
     <w:pPr>
       <w:spacing w:after="80" w:line="240" w:lineRule="auto"/>
       <w:contextualSpacing/>
@@ -1017,7 +1037,7 @@
     <w:basedOn w:val="Fontepargpadro"/>
     <w:link w:val="Ttulo"/>
     <w:uiPriority w:val="10"/>
-    <w:rsid w:val="00DE21B1"/>
+    <w:rsid w:val="00E26CF4"/>
     <w:rPr>
       <w:rFonts w:asciiTheme="majorHAnsi" w:eastAsiaTheme="majorEastAsia" w:hAnsiTheme="majorHAnsi" w:cstheme="majorBidi"/>
       <w:spacing w:val="-10"/>
@@ -1033,7 +1053,7 @@
     <w:link w:val="SubttuloChar"/>
     <w:uiPriority w:val="11"/>
     <w:qFormat/>
-    <w:rsid w:val="00DE21B1"/>
+    <w:rsid w:val="00E26CF4"/>
     <w:pPr>
       <w:numPr>
         <w:ilvl w:val="1"/>
@@ -1052,7 +1072,7 @@
     <w:basedOn w:val="Fontepargpadro"/>
     <w:link w:val="Subttulo"/>
     <w:uiPriority w:val="11"/>
-    <w:rsid w:val="00DE21B1"/>
+    <w:rsid w:val="00E26CF4"/>
     <w:rPr>
       <w:rFonts w:eastAsiaTheme="majorEastAsia" w:cstheme="majorBidi"/>
       <w:color w:val="595959" w:themeColor="text1" w:themeTint="A6"/>
@@ -1068,7 +1088,7 @@
     <w:link w:val="CitaoChar"/>
     <w:uiPriority w:val="29"/>
     <w:qFormat/>
-    <w:rsid w:val="00DE21B1"/>
+    <w:rsid w:val="00E26CF4"/>
     <w:pPr>
       <w:spacing w:before="160"/>
       <w:jc w:val="center"/>
@@ -1084,7 +1104,7 @@
     <w:basedOn w:val="Fontepargpadro"/>
     <w:link w:val="Citao"/>
     <w:uiPriority w:val="29"/>
-    <w:rsid w:val="00DE21B1"/>
+    <w:rsid w:val="00E26CF4"/>
     <w:rPr>
       <w:i/>
       <w:iCs/>
@@ -1096,7 +1116,7 @@
     <w:basedOn w:val="Normal"/>
     <w:uiPriority w:val="34"/>
     <w:qFormat/>
-    <w:rsid w:val="00DE21B1"/>
+    <w:rsid w:val="00E26CF4"/>
     <w:pPr>
       <w:ind w:left="720"/>
       <w:contextualSpacing/>
@@ -1107,7 +1127,7 @@
     <w:basedOn w:val="Fontepargpadro"/>
     <w:uiPriority w:val="21"/>
     <w:qFormat/>
-    <w:rsid w:val="00DE21B1"/>
+    <w:rsid w:val="00E26CF4"/>
     <w:rPr>
       <w:i/>
       <w:iCs/>
@@ -1121,7 +1141,7 @@
     <w:link w:val="CitaoIntensaChar"/>
     <w:uiPriority w:val="30"/>
     <w:qFormat/>
-    <w:rsid w:val="00DE21B1"/>
+    <w:rsid w:val="00E26CF4"/>
     <w:pPr>
       <w:pBdr>
         <w:top w:val="single" w:sz="4" w:space="10" w:color="0F4761" w:themeColor="accent1" w:themeShade="BF"/>
@@ -1142,7 +1162,7 @@
     <w:basedOn w:val="Fontepargpadro"/>
     <w:link w:val="CitaoIntensa"/>
     <w:uiPriority w:val="30"/>
-    <w:rsid w:val="00DE21B1"/>
+    <w:rsid w:val="00E26CF4"/>
     <w:rPr>
       <w:i/>
       <w:iCs/>
@@ -1154,7 +1174,7 @@
     <w:basedOn w:val="Fontepargpadro"/>
     <w:uiPriority w:val="32"/>
     <w:qFormat/>
-    <w:rsid w:val="00DE21B1"/>
+    <w:rsid w:val="00E26CF4"/>
     <w:rPr>
       <w:b/>
       <w:bCs/>

</xml_diff>